<commit_message>
Mark corresponding authors (*) in publications
Co-Authored-By: Claude Opus 5.5 <noreply@anthropic.com>
</commit_message>
<xml_diff>
--- a/cv/Helena_Mannochio_Russo_CV.docx
+++ b/cv/Helena_Mannochio_Russo_CV.docx
@@ -1471,6 +1471,15 @@
           <w:sz w:val="18"/>
         </w:rPr>
         <w:t>, Crystal X. Wang, Corinn Walker, Karsten Zengler, Dionicio Siegel, Pieter C. Dorrestein</w:t>
+      </w:r>
+      <w:r>
+        <w:rPr>
+          <w:b/>
+          <w:color w:val="B4682C"/>
+          <w:sz w:val="18"/>
+          <w:vertAlign w:val="superscript"/>
+        </w:rPr>
+        <w:t>*</w:t>
       </w:r>
       <w:r>
         <w:br/>
@@ -1650,7 +1659,32 @@
           <w:color w:val="5B6475"/>
           <w:sz w:val="18"/>
         </w:rPr>
-        <w:t>, Haoqi Nina Zhao, Kine Eide Kvitne, Shipei Xing, Harsha Gouda, Julius Agongo, Ipsita Mohanty, Vincent Charron-Lamoureux, Prajit Rajkumar, Abzer K. Pakkir Shah, Axel Walter, Rithi Krishnaraj, Yasin El Abiead, Patrick C. Ferreira, Simone Zuffa, Abubaker Patan, Andrés Mauricio Caraballo-Rodríguez, Wout Bittremieux, Daniel Petras, Mingxun Wang, Pieter C. Dorrestein</w:t>
+        <w:t>, Haoqi Nina Zhao, Kine Eide Kvitne, Shipei Xing, Harsha Gouda, Julius Agongo, Ipsita Mohanty, Vincent Charron-Lamoureux, Prajit Rajkumar, Abzer K. Pakkir Shah, Axel Walter, Rithi Krishnaraj, Yasin El Abiead, Patrick C. Ferreira, Simone Zuffa, Abubaker Patan, Andrés Mauricio Caraballo-Rodríguez, Wout Bittremieux, Daniel Petras, Mingxun Wang</w:t>
+      </w:r>
+      <w:r>
+        <w:rPr>
+          <w:b/>
+          <w:color w:val="B4682C"/>
+          <w:sz w:val="18"/>
+          <w:vertAlign w:val="superscript"/>
+        </w:rPr>
+        <w:t>*</w:t>
+      </w:r>
+      <w:r>
+        <w:rPr>
+          <w:color w:val="5B6475"/>
+          <w:sz w:val="18"/>
+        </w:rPr>
+        <w:t>, Pieter C. Dorrestein</w:t>
+      </w:r>
+      <w:r>
+        <w:rPr>
+          <w:b/>
+          <w:color w:val="B4682C"/>
+          <w:sz w:val="18"/>
+          <w:vertAlign w:val="superscript"/>
+        </w:rPr>
+        <w:t>*</w:t>
       </w:r>
       <w:r>
         <w:br/>
@@ -1759,6 +1793,15 @@
         <w:t>, Marta Sala-Climent, Nathan Argel, Anna Quan, Michal Kalli Hose, Rocio Paz-Gonzalez, Meghana Akkati, Eric Chang, Adnan Cutuk, Emily Gentry, Roxana Coras, Nancy E. Lane, Pieter C. Dorrestein, Monica Guma</w:t>
       </w:r>
       <w:r>
+        <w:rPr>
+          <w:b/>
+          <w:color w:val="B4682C"/>
+          <w:sz w:val="18"/>
+          <w:vertAlign w:val="superscript"/>
+        </w:rPr>
+        <w:t>*</w:t>
+      </w:r>
+      <w:r>
         <w:br/>
       </w:r>
       <w:r>
@@ -1840,6 +1883,15 @@
         <w:t>, Jeong Joo Pyo, Min Soo Kim, Shuchang Tian, Imhoi Koo, Elliot S. Friedman, Ceylan Tanes, Mallappa Anitha, Yuan Tian, Ethan W. Morgan, Iain A. Murray, Joseph P. Zackular, Kyle Bittinger, James D. Lewis, Gary H. Perdew, Gary D. Wu, Babette S. Zemel, Pieter C. Dorrestein, Jordan E. Bisanz, Matthew R. Redinbo, Andrew D. Patterson</w:t>
       </w:r>
       <w:r>
+        <w:rPr>
+          <w:b/>
+          <w:color w:val="B4682C"/>
+          <w:sz w:val="18"/>
+          <w:vertAlign w:val="superscript"/>
+        </w:rPr>
+        <w:t>*</w:t>
+      </w:r>
+      <w:r>
         <w:br/>
       </w:r>
       <w:r>
@@ -1903,7 +1955,23 @@
           <w:color w:val="5B6475"/>
           <w:sz w:val="18"/>
         </w:rPr>
-        <w:t xml:space="preserve">Yasin El Abiead, Jeong In Seo, Vincent Charron-Lamoureux, Michael Strobel, Wilhan Donizete Gonçalves Nunes, Haoqi Nina Zhao, Kine Eide Kvitne, Simone Zuffa, </w:t>
+        <w:t>Yasin El Abiead</w:t>
+      </w:r>
+      <w:r>
+        <w:rPr>
+          <w:b/>
+          <w:color w:val="B4682C"/>
+          <w:sz w:val="18"/>
+          <w:vertAlign w:val="superscript"/>
+        </w:rPr>
+        <w:t>*</w:t>
+      </w:r>
+      <w:r>
+        <w:rPr>
+          <w:color w:val="5B6475"/>
+          <w:sz w:val="18"/>
+        </w:rPr>
+        <w:t xml:space="preserve">, Jeong In Seo, Vincent Charron-Lamoureux, Michael Strobel, Wilhan Donizete Gonçalves Nunes, Haoqi Nina Zhao, Kine Eide Kvitne, Simone Zuffa, </w:t>
       </w:r>
       <w:r>
         <w:rPr>
@@ -1918,7 +1986,32 @@
           <w:color w:val="5B6475"/>
           <w:sz w:val="18"/>
         </w:rPr>
-        <w:t>, Harsha Gouda, Cristina Bez, Abubaker Patan, Shipei Xing, Jasmine Zemlin, Ipsita Mohany, Julius Agongo, Andres Mauricio Caraballo Rodriguez, Lindsey A. Burnett, Victoria Deleray, Abzer K. Pakkir Shah, Jarmo-Charles Kalinski, Daniel Petras, Nikiforos Alygizakis, Jeremy Carver, Ozgur Yurekten, Thomas Payne, Eoin Fahy, Shankar Subramaniam, Juan Antonio Vizcaíno, Mingxun Wang, Pieter C. Dorrestein</w:t>
+        <w:t>, Harsha Gouda, Cristina Bez, Abubaker Patan, Shipei Xing, Jasmine Zemlin, Ipsita Mohany, Julius Agongo, Andres Mauricio Caraballo Rodriguez, Lindsey A. Burnett, Victoria Deleray, Abzer K. Pakkir Shah, Jarmo-Charles Kalinski, Daniel Petras, Nikiforos Alygizakis, Jeremy Carver, Ozgur Yurekten, Thomas Payne, Eoin Fahy, Shankar Subramaniam, Juan Antonio Vizcaíno, Mingxun Wang</w:t>
+      </w:r>
+      <w:r>
+        <w:rPr>
+          <w:b/>
+          <w:color w:val="B4682C"/>
+          <w:sz w:val="18"/>
+          <w:vertAlign w:val="superscript"/>
+        </w:rPr>
+        <w:t>*</w:t>
+      </w:r>
+      <w:r>
+        <w:rPr>
+          <w:color w:val="5B6475"/>
+          <w:sz w:val="18"/>
+        </w:rPr>
+        <w:t>, Pieter C. Dorrestein</w:t>
+      </w:r>
+      <w:r>
+        <w:rPr>
+          <w:b/>
+          <w:color w:val="B4682C"/>
+          <w:sz w:val="18"/>
+          <w:vertAlign w:val="superscript"/>
+        </w:rPr>
+        <w:t>*</w:t>
       </w:r>
       <w:r>
         <w:br/>
@@ -2002,6 +2095,15 @@
         <w:t>, Ethan W. Morgan, Nina R. Boyle, Imhoi Koo, Emma Coudriet, Fuhua Hao, Ipsita Mohanty, Gary H. Perdew, Pieter C. Dorrestein, Andrew D. Patterson</w:t>
       </w:r>
       <w:r>
+        <w:rPr>
+          <w:b/>
+          <w:color w:val="B4682C"/>
+          <w:sz w:val="18"/>
+          <w:vertAlign w:val="superscript"/>
+        </w:rPr>
+        <w:t>*</w:t>
+      </w:r>
+      <w:r>
         <w:br/>
       </w:r>
       <w:r>
@@ -2083,6 +2185,15 @@
         <w:t>, Wilhan D. Gonçalves Nunes, Jasmine Zemlin, Itzhak Mizrahi, Dionicio Siegel, Mingxun Wang, Lee R. Hagey, Pieter C. Dorrestein</w:t>
       </w:r>
       <w:r>
+        <w:rPr>
+          <w:b/>
+          <w:color w:val="B4682C"/>
+          <w:sz w:val="18"/>
+          <w:vertAlign w:val="superscript"/>
+        </w:rPr>
+        <w:t>*</w:t>
+      </w:r>
+      <w:r>
         <w:br/>
       </w:r>
       <w:r>
@@ -2181,6 +2292,15 @@
         <w:t>, Jaqueline Munise Guimarães da Silva, Martina Herrmann, Rodrigo Sant’ana Cabral, Maria Luiza Zeraik</w:t>
       </w:r>
       <w:r>
+        <w:rPr>
+          <w:b/>
+          <w:color w:val="B4682C"/>
+          <w:sz w:val="18"/>
+          <w:vertAlign w:val="superscript"/>
+        </w:rPr>
+        <w:t>*</w:t>
+      </w:r>
+      <w:r>
         <w:br/>
       </w:r>
       <w:r>
@@ -2262,6 +2382,15 @@
         <w:t>, Jasmine Zemlin, Lindsey A. Burnett, Lisa S. Zhang, Mia C. Cecala, Ceylan Ersoz, James A. Connelly, Natasha Halasa, Maribeth Nicholson, Pieter C. Dorrestein, Shirley M. Tsunoda, Janet Markle</w:t>
       </w:r>
       <w:r>
+        <w:rPr>
+          <w:b/>
+          <w:color w:val="B4682C"/>
+          <w:sz w:val="18"/>
+          <w:vertAlign w:val="superscript"/>
+        </w:rPr>
+        <w:t>*</w:t>
+      </w:r>
+      <w:r>
         <w:br/>
       </w:r>
       <w:r>
@@ -2343,6 +2472,15 @@
         <w:t>, Madison Ambre, Nicole E. Avalon, MacKenzie Bryant, Lindsey A. Burnett, Andrés Mauricio Caraballo-Rodríguez, Martin Casas Maya, Loryn Chin, Lluís Corominas, Ronald J. Ellis, Donald Franklin, Sagan Girod, Paulo Wender P. Gomes, Lauren Hansen, Robert K. Heaton, Jennifer E. Iudicello, Alan K. Jarmusch, Lora Khatib, Scott Letendre, Sarolt Magyari, Daniel McDonald, Ipsita Mohanty, Andrés Cumsille, David J. Moore, Prajit Rajkumar, Dylan H. Ross, Harshada Sapre, Mohammad Reza Zare Shahneh, Ruben Gil-Solsona, Sydney P. Thomas, Caitlin Tribelhorn, Helena M. Tubb, Corinn Walker, Crystal X. Wang, Jasmine Zemlin, Simone Zuffa, David S. Wishart, Pablo Gago-Ferrero, Rima Kaddurah-Daouk, Mingxun Wang, Manuela Raffatellu, Karsten Zengler, Tomáš Pluskal, Libin Xu, Rob Knight, Shirley M. Tsunoda, Pieter C. Dorrestein</w:t>
       </w:r>
       <w:r>
+        <w:rPr>
+          <w:b/>
+          <w:color w:val="B4682C"/>
+          <w:sz w:val="18"/>
+          <w:vertAlign w:val="superscript"/>
+        </w:rPr>
+        <w:t>*</w:t>
+      </w:r>
+      <w:r>
         <w:br/>
       </w:r>
       <w:r>
@@ -2421,7 +2559,32 @@
           <w:color w:val="5B6475"/>
           <w:sz w:val="18"/>
         </w:rPr>
-        <w:t>, Celeste Allaband, Michal K. Hose, Anna Quan, Soo-In Choi, Katherine Nguyen, Shahrokh Golshan, Rebecca B. Blank, Tiffany Holt, Nancy E. Lane, Rob Knight, Jose Scher, Pieter Dorrestein, Jose Clemente, Monica Guma</w:t>
+        <w:t>, Celeste Allaband, Michal K. Hose, Anna Quan, Soo-In Choi, Katherine Nguyen, Shahrokh Golshan, Rebecca B. Blank, Tiffany Holt, Nancy E. Lane, Rob Knight, Jose Scher, Pieter Dorrestein, Jose Clemente</w:t>
+      </w:r>
+      <w:r>
+        <w:rPr>
+          <w:b/>
+          <w:color w:val="B4682C"/>
+          <w:sz w:val="18"/>
+          <w:vertAlign w:val="superscript"/>
+        </w:rPr>
+        <w:t>*</w:t>
+      </w:r>
+      <w:r>
+        <w:rPr>
+          <w:color w:val="5B6475"/>
+          <w:sz w:val="18"/>
+        </w:rPr>
+        <w:t>, Monica Guma</w:t>
+      </w:r>
+      <w:r>
+        <w:rPr>
+          <w:b/>
+          <w:color w:val="B4682C"/>
+          <w:sz w:val="18"/>
+          <w:vertAlign w:val="superscript"/>
+        </w:rPr>
+        <w:t>*</w:t>
       </w:r>
       <w:r>
         <w:br/>
@@ -2498,6 +2661,15 @@
         <w:t>, Vincent Charron-Lamoureux, Martijn van Faassen, Santosh Lamichhane, Wilhan D. Gonçalves Nunes, Victoria Deleray, Adriana V. Ayala, Yuichiro Tanaka, Abubaker Patan, Kyle Vittali, Prajit Rajkumar, Yasin El Abiead, Haoqi Nina Zhao, Paulo Wender Portal Gomes, Ipsita Mohanty, Carlynda Lee, Aidan Sund, Meera Sharma, Yuanhao Liu, David Pattynama, Gregory T. Walker, Grant J. Norton, Lora Khatib, Mohammadsobhan S. Andalibi, Crystal X. Wang, Ronald J. Ellis, David J. Moore, Jennifer E. Iudicello, Donald Franklin, Scott Letendre, Loryn Chin, Corinn Walker, Simone Renwick, Jasmine Zemlin, Michael J. Meehan, Xinyang Song, Dennis Kasper, Zachary Burcham, Jane J. Kim, Sejal Kadakia, Manuela Raffatellu, Lars Bode, Hiutung Chu, Karsten Zengler, Mingxun Wang, Dionicio Siegel, Rob Knight, Pieter C. Dorrestein</w:t>
       </w:r>
       <w:r>
+        <w:rPr>
+          <w:b/>
+          <w:color w:val="B4682C"/>
+          <w:sz w:val="18"/>
+          <w:vertAlign w:val="superscript"/>
+        </w:rPr>
+        <w:t>*</w:t>
+      </w:r>
+      <w:r>
         <w:br/>
       </w:r>
       <w:r>
@@ -2579,6 +2751,15 @@
         <w:t>, Ipsita Mohanty, Haoqi Nina Zhao, Andres M. Caraballo-Rodriguez, Paulo Wender P. Gomes, Nicole E. Avalon, Trent R. Northen, Benjamin P. Bowen, Katherine B. Louie, Pieter C. Dorrestein, Mingxun Wang</w:t>
       </w:r>
       <w:r>
+        <w:rPr>
+          <w:b/>
+          <w:color w:val="B4682C"/>
+          <w:sz w:val="18"/>
+          <w:vertAlign w:val="superscript"/>
+        </w:rPr>
+        <w:t>*</w:t>
+      </w:r>
+      <w:r>
         <w:br/>
       </w:r>
       <w:r>
@@ -2651,7 +2832,23 @@
           <w:color w:val="5B6475"/>
           <w:sz w:val="18"/>
         </w:rPr>
-        <w:t xml:space="preserve">Paulo Wender Portal Gomes, </w:t>
+        <w:t>Paulo Wender Portal Gomes</w:t>
+      </w:r>
+      <w:r>
+        <w:rPr>
+          <w:b/>
+          <w:color w:val="B4682C"/>
+          <w:sz w:val="18"/>
+          <w:vertAlign w:val="superscript"/>
+        </w:rPr>
+        <w:t>*</w:t>
+      </w:r>
+      <w:r>
+        <w:rPr>
+          <w:color w:val="5B6475"/>
+          <w:sz w:val="18"/>
+        </w:rPr>
+        <w:t xml:space="preserve">, </w:t>
       </w:r>
       <w:r>
         <w:rPr>
@@ -2667,6 +2864,15 @@
           <w:sz w:val="18"/>
         </w:rPr>
         <w:t>, Stanislav N. lablokov, Dmitry A. Rodionov, Heejung Yang, Pieter C. Dorrestein, Scott N. Peterson, Christine Tara Peterson</w:t>
+      </w:r>
+      <w:r>
+        <w:rPr>
+          <w:b/>
+          <w:color w:val="B4682C"/>
+          <w:sz w:val="18"/>
+          <w:vertAlign w:val="superscript"/>
+        </w:rPr>
+        <w:t>*</w:t>
       </w:r>
       <w:r>
         <w:br/>
@@ -2750,6 +2956,15 @@
         <w:t>, Michael T. Marty, Yuki Matsuzawa, Andrew C. McAvoy, Laura-Isobel McCall, Osama G. Mohamed, Omri Nahor, Heiko Neuweger, Timo H. J. Niedermeyer, Kozo Nishida, Trent R. Northen, Kirsten E. Overdahl, Johannes Rainer, Raphael Reher, Elys Rodriguez, Timo T. Sachsenberg, Laura M. Sanchez, Robin Schmid, Cole Stevens, Shankar Subramaniam, Zhenyu Tian, Ashootosh Tripathi, Hiroshi Tsugawa, Justin J. J. van der Hooft, Andrea Vicini, Axel Walter, Tilmann Weber, Quanbo Xiong, Tao Xu, Tomáš Pluskal, Pieter C. Dorrestein, Mingxun Wang</w:t>
       </w:r>
       <w:r>
+        <w:rPr>
+          <w:b/>
+          <w:color w:val="B4682C"/>
+          <w:sz w:val="18"/>
+          <w:vertAlign w:val="superscript"/>
+        </w:rPr>
+        <w:t>*</w:t>
+      </w:r>
+      <w:r>
         <w:br/>
       </w:r>
       <w:r>
@@ -2848,6 +3063,15 @@
         <w:t>, Ana Lucia Tasca Gois Ruiz, Mary Ann Foglio, Marta Regina Barrotto do Carmo, Maria Helena Sarragiotto, Debora Cristina Baldoqui</w:t>
       </w:r>
       <w:r>
+        <w:rPr>
+          <w:b/>
+          <w:color w:val="B4682C"/>
+          <w:sz w:val="18"/>
+          <w:vertAlign w:val="superscript"/>
+        </w:rPr>
+        <w:t>*</w:t>
+      </w:r>
+      <w:r>
         <w:br/>
       </w:r>
       <w:r>
@@ -2926,7 +3150,32 @@
           <w:color w:val="5B6475"/>
           <w:sz w:val="18"/>
         </w:rPr>
-        <w:t>, Simone Zuffa, Renee E. Oles, Allegra T. Aron, Yasin El Abiead, Sawyer Farmer, Antonio González, Cameron Martino, Ipsita Mohanty, Ceth W. Parker, Lucas Patel, Paulo Wender Portal Gomes, Robin Schmid, Tara Schwartz, Jennifer Zhu, Michael R. Barratt, Kathleen H. Rubins, Hiutung Chu, Fathi Karouia, Kasthuri Venkateswaran, Pieter C. Dorrestein, Rob Knight</w:t>
+        <w:t>, Simone Zuffa, Renee E. Oles, Allegra T. Aron, Yasin El Abiead, Sawyer Farmer, Antonio González, Cameron Martino, Ipsita Mohanty, Ceth W. Parker, Lucas Patel, Paulo Wender Portal Gomes, Robin Schmid, Tara Schwartz, Jennifer Zhu, Michael R. Barratt, Kathleen H. Rubins, Hiutung Chu, Fathi Karouia, Kasthuri Venkateswaran, Pieter C. Dorrestein</w:t>
+      </w:r>
+      <w:r>
+        <w:rPr>
+          <w:b/>
+          <w:color w:val="B4682C"/>
+          <w:sz w:val="18"/>
+          <w:vertAlign w:val="superscript"/>
+        </w:rPr>
+        <w:t>*</w:t>
+      </w:r>
+      <w:r>
+        <w:rPr>
+          <w:color w:val="5B6475"/>
+          <w:sz w:val="18"/>
+        </w:rPr>
+        <w:t>, Rob Knight</w:t>
+      </w:r>
+      <w:r>
+        <w:rPr>
+          <w:b/>
+          <w:color w:val="B4682C"/>
+          <w:sz w:val="18"/>
+          <w:vertAlign w:val="superscript"/>
+        </w:rPr>
+        <w:t>*</w:t>
       </w:r>
       <w:r>
         <w:br/>
@@ -3010,6 +3259,15 @@
         <w:t>, Michael Witting, Ipsita Mohanty, Tomáš Pluskal, Wout Bittremieux, Rob Knight, Andrew D. Patterson, Justin J. J. van der Hooft, Sebastian Böcker, Warwick B. Dunn, Roger G. Linington, David S. Wishart, Jean-Luc Wolfender, Oliver Fiehn, Nicola Zamboni, Pieter C. Dorrestein</w:t>
       </w:r>
       <w:r>
+        <w:rPr>
+          <w:b/>
+          <w:color w:val="B4682C"/>
+          <w:sz w:val="18"/>
+          <w:vertAlign w:val="superscript"/>
+        </w:rPr>
+        <w:t>*</w:t>
+      </w:r>
+      <w:r>
         <w:br/>
       </w:r>
       <w:r>
@@ -3091,6 +3349,15 @@
         <w:t>, Santosh Lamichhane, Shipei Xing, Abubaker Patan, Paulo Wender Portal Gomes, Prajit Rajkumar, Victoria Deleray, Andrés Mauricio Caraballo-Rodríguez, Kee Voon Chua, Lye Siang Lee, Zhao Liu, Jianhong Ching, Mingxun Wang, Pieter C. Dorrestein</w:t>
       </w:r>
       <w:r>
+        <w:rPr>
+          <w:b/>
+          <w:color w:val="B4682C"/>
+          <w:sz w:val="18"/>
+          <w:vertAlign w:val="superscript"/>
+        </w:rPr>
+        <w:t>*</w:t>
+      </w:r>
+      <w:r>
         <w:br/>
       </w:r>
       <w:r>
@@ -3159,6 +3426,15 @@
       </w:r>
       <w:r>
         <w:rPr>
+          <w:b/>
+          <w:color w:val="B4682C"/>
+          <w:sz w:val="18"/>
+          <w:vertAlign w:val="superscript"/>
+        </w:rPr>
+        <w:t>*</w:t>
+      </w:r>
+      <w:r>
+        <w:rPr>
           <w:color w:val="5B6475"/>
           <w:sz w:val="18"/>
         </w:rPr>
@@ -3246,6 +3522,15 @@
         <w:t>, Ana dos Santos, Aglaete Pinheiro, Luna Vasconcelos, Ana Paula Santos, Lila de Oliveira, Monique Martins, Marcelo de Andrade, Maria Nascimento, Vanderlan Bolzani, Josélia Lima, Cláudia da Rocha</w:t>
       </w:r>
       <w:r>
+        <w:rPr>
+          <w:b/>
+          <w:color w:val="B4682C"/>
+          <w:sz w:val="18"/>
+          <w:vertAlign w:val="superscript"/>
+        </w:rPr>
+        <w:t>*</w:t>
+      </w:r>
+      <w:r>
         <w:br/>
       </w:r>
       <w:r>
@@ -3327,6 +3612,15 @@
         <w:t>, Yasin El Abiead, Lee R. Hagey, Rob Knight, Pieter C. Dorrestein</w:t>
       </w:r>
       <w:r>
+        <w:rPr>
+          <w:b/>
+          <w:color w:val="B4682C"/>
+          <w:sz w:val="18"/>
+          <w:vertAlign w:val="superscript"/>
+        </w:rPr>
+        <w:t>*</w:t>
+      </w:r>
+      <w:r>
         <w:br/>
       </w:r>
       <w:r>
@@ -3507,6 +3801,15 @@
         <w:t>, Junhong Mao, Haoqi Nina Zhao, Jacob Ancira, Craig D. Tipton, Pieter C. Dorrestein, Min Li</w:t>
       </w:r>
       <w:r>
+        <w:rPr>
+          <w:b/>
+          <w:color w:val="B4682C"/>
+          <w:sz w:val="18"/>
+          <w:vertAlign w:val="superscript"/>
+        </w:rPr>
+        <w:t>*</w:t>
+      </w:r>
+      <w:r>
         <w:br/>
       </w:r>
       <w:r>
@@ -3613,6 +3916,15 @@
         <w:t>, Joshua V. Schweer, Yasin El Abiead, Wout Bittremieux, Shipei Xing, Robin Schmid, Simone Zuffa, Felipe Vasquez, Valentina B. Muti, Jasmine Zemlin, Omar E. Tovar-Herrera, Sarah Moraïs, Dhimant Desai, Shantu Amin, Imhoi Koo, Christoph W. Turck, Itzhak Mizrahi, Penny M. Kris-Etherton, Kristina S. Petersen, Jennifer A. Fleming, Tao Huan, Andrew D. Patterson, Dionicio Siegel, Lee R. Hagey, Mingxun Wang, Allegra T. Aron, Pieter C. Dorrestein</w:t>
       </w:r>
       <w:r>
+        <w:rPr>
+          <w:b/>
+          <w:color w:val="B4682C"/>
+          <w:sz w:val="18"/>
+          <w:vertAlign w:val="superscript"/>
+        </w:rPr>
+        <w:t>*</w:t>
+      </w:r>
+      <w:r>
         <w:br/>
       </w:r>
       <w:r>
@@ -3694,6 +4006,15 @@
         <w:t>, Gustavo Galo Marcheafave, Vanderlan da Silva Bolzani, Estela de Oliveira Nunes, Waldir Pereira Dias, Clara Beatriz Hoffmann-Campo, Maria Luiza Zeraik</w:t>
       </w:r>
       <w:r>
+        <w:rPr>
+          <w:b/>
+          <w:color w:val="B4682C"/>
+          <w:sz w:val="18"/>
+          <w:vertAlign w:val="superscript"/>
+        </w:rPr>
+        <w:t>*</w:t>
+      </w:r>
+      <w:r>
         <w:br/>
       </w:r>
       <w:r>
@@ -3757,7 +4078,23 @@
           <w:color w:val="5B6475"/>
           <w:sz w:val="18"/>
         </w:rPr>
-        <w:t xml:space="preserve">Jacky M. Deng, Salma Elgaili Ahmed, Ernest Awoonor-Williams, Progna Banerjee, Magda H. Barecka, Laura E. Bickerton, Silvina A. Di Pietro, Stanna K. Dorn, Kevin Maik Jablonka, Gabriele Laudadio, Elisabeth Kreidt, </w:t>
+        <w:t>Jacky M. Deng</w:t>
+      </w:r>
+      <w:r>
+        <w:rPr>
+          <w:b/>
+          <w:color w:val="B4682C"/>
+          <w:sz w:val="18"/>
+          <w:vertAlign w:val="superscript"/>
+        </w:rPr>
+        <w:t>*</w:t>
+      </w:r>
+      <w:r>
+        <w:rPr>
+          <w:color w:val="5B6475"/>
+          <w:sz w:val="18"/>
+        </w:rPr>
+        <w:t xml:space="preserve">, Salma Elgaili Ahmed, Ernest Awoonor-Williams, Progna Banerjee, Magda H. Barecka, Laura E. Bickerton, Silvina A. Di Pietro, Stanna K. Dorn, Kevin Maik Jablonka, Gabriele Laudadio, Elisabeth Kreidt, </w:t>
       </w:r>
       <w:r>
         <w:rPr>
@@ -3838,7 +4175,23 @@
           <w:color w:val="5B6475"/>
           <w:sz w:val="18"/>
         </w:rPr>
-        <w:t xml:space="preserve">Wout Bittremieux, Nicole E. Avalon, Sydney P. Thomas, Sarvar A. Kakhkhorov, Alexander A. Aksenov, Paulo Wender P. Gomes, Christine M. Aceves, Andrés Mauricio Caraballo-Rodríguez, Julia M. Gauglitz, William H. Gerwick, Tao Huan, Alan K. Jarmusch, Rima F. Kaddurah-Daouk, Kyo Bin Kang, Hyun Woo Kim, Todor Kondić, </w:t>
+        <w:t>Wout Bittremieux</w:t>
+      </w:r>
+      <w:r>
+        <w:rPr>
+          <w:b/>
+          <w:color w:val="B4682C"/>
+          <w:sz w:val="18"/>
+          <w:vertAlign w:val="superscript"/>
+        </w:rPr>
+        <w:t>*</w:t>
+      </w:r>
+      <w:r>
+        <w:rPr>
+          <w:color w:val="5B6475"/>
+          <w:sz w:val="18"/>
+        </w:rPr>
+        <w:t xml:space="preserve">, Nicole E. Avalon, Sydney P. Thomas, Sarvar A. Kakhkhorov, Alexander A. Aksenov, Paulo Wender P. Gomes, Christine M. Aceves, Andrés Mauricio Caraballo-Rodríguez, Julia M. Gauglitz, William H. Gerwick, Tao Huan, Alan K. Jarmusch, Rima F. Kaddurah-Daouk, Kyo Bin Kang, Hyun Woo Kim, Todor Kondić, </w:t>
       </w:r>
       <w:r>
         <w:rPr>
@@ -3854,6 +4207,15 @@
           <w:sz w:val="18"/>
         </w:rPr>
         <w:t>, Michael J. Meehan, Alexey V. Melnik, Louis-Felix Nothias, Claire O’Donovan, Morgan Panitchpakdi, Daniel Petras, Robin Schmid, Emma L. Schymanski, Justin J. J. van der Hooft, Kelly C. Weldon, Heejung Yang, Shipei Xing, Jasmine Zemlin, Mingxun Wang, Pieter C. Dorrestein</w:t>
+      </w:r>
+      <w:r>
+        <w:rPr>
+          <w:b/>
+          <w:color w:val="B4682C"/>
+          <w:sz w:val="18"/>
+          <w:vertAlign w:val="superscript"/>
+        </w:rPr>
+        <w:t>*</w:t>
       </w:r>
       <w:r>
         <w:br/>
@@ -3919,7 +4281,23 @@
           <w:color w:val="5B6475"/>
           <w:sz w:val="18"/>
         </w:rPr>
-        <w:t xml:space="preserve">Paulo Wender P. Gomes, Emilli Roberta S. Gomes, Alice R.V. Carvalho, </w:t>
+        <w:t>Paulo Wender P. Gomes</w:t>
+      </w:r>
+      <w:r>
+        <w:rPr>
+          <w:b/>
+          <w:color w:val="B4682C"/>
+          <w:sz w:val="18"/>
+          <w:vertAlign w:val="superscript"/>
+        </w:rPr>
+        <w:t>*</w:t>
+      </w:r>
+      <w:r>
+        <w:rPr>
+          <w:color w:val="5B6475"/>
+          <w:sz w:val="18"/>
+        </w:rPr>
+        <w:t xml:space="preserve">, Emilli Roberta S. Gomes, Alice R.V. Carvalho, </w:t>
       </w:r>
       <w:r>
         <w:rPr>
@@ -3935,6 +4313,15 @@
           <w:sz w:val="18"/>
         </w:rPr>
         <w:t>, Tiago F. Leão, José Diogo E. Reis, Maria Rosilda V. de Sarges, Horrana A. Mardegan, Sônia das G.S.R. Pamplona, Consuelo Yumiko Y. e Silva, Milton N. da Silva</w:t>
+      </w:r>
+      <w:r>
+        <w:rPr>
+          <w:b/>
+          <w:color w:val="B4682C"/>
+          <w:sz w:val="18"/>
+          <w:vertAlign w:val="superscript"/>
+        </w:rPr>
+        <w:t>*</w:t>
       </w:r>
       <w:r>
         <w:br/>
@@ -4018,6 +4405,15 @@
         <w:t>, Cajetan Dogo-isonagie, Om Patel, Paloma Pimenta, Jennifer Gronlund, Stacey Lavender, Shira Pilch, Venda Maloney, Michael North, Pieter C. Dorrestein</w:t>
       </w:r>
       <w:r>
+        <w:rPr>
+          <w:b/>
+          <w:color w:val="B4682C"/>
+          <w:sz w:val="18"/>
+          <w:vertAlign w:val="superscript"/>
+        </w:rPr>
+        <w:t>*</w:t>
+      </w:r>
+      <w:r>
         <w:br/>
       </w:r>
       <w:r>
@@ -4117,6 +4513,15 @@
         <w:t>, Paula Carolina Pires Bueno, Rafael Vieira, Meri Emili Ferreira Pinto, Suzana Aparecida Silva Queiroz, Luiz Antonio Dutra, Lidiane Gaspareto Felippe, Andrea Nastri de Luca Batista, Tatiana Maria de Souza-Moreira, Marilia Valli, Rebeca Previate Medina, Angela Regina Araujo, Alan Cesar Pilon, Ian Castro-Gamboa, Alberto José Cavalheiro, Dulce Helena Siqueira Silva, Maysa Furlan, Vanderlan da Silva Bolzani</w:t>
       </w:r>
       <w:r>
+        <w:rPr>
+          <w:b/>
+          <w:color w:val="B4682C"/>
+          <w:sz w:val="18"/>
+          <w:vertAlign w:val="superscript"/>
+        </w:rPr>
+        <w:t>*</w:t>
+      </w:r>
+      <w:r>
         <w:br/>
       </w:r>
       <w:r>
@@ -4190,7 +4595,7 @@
           <w:sz w:val="18"/>
           <w:vertAlign w:val="superscript"/>
         </w:rPr>
-        <w:t>†</w:t>
+        <w:t>†*</w:t>
       </w:r>
       <w:r>
         <w:rPr>
@@ -4206,7 +4611,7 @@
           <w:sz w:val="18"/>
           <w:vertAlign w:val="superscript"/>
         </w:rPr>
-        <w:t>†</w:t>
+        <w:t>†*</w:t>
       </w:r>
       <w:r>
         <w:rPr>
@@ -4297,6 +4702,15 @@
         <w:t>, Guilherme Isquibola, Richard Perosa Fernandes, Aniele de Moura, Vanderlan da Silva Bolzani, Flávio Junior Caires</w:t>
       </w:r>
       <w:r>
+        <w:rPr>
+          <w:b/>
+          <w:color w:val="B4682C"/>
+          <w:sz w:val="18"/>
+          <w:vertAlign w:val="superscript"/>
+        </w:rPr>
+        <w:t>*</w:t>
+      </w:r>
+      <w:r>
         <w:br/>
       </w:r>
       <w:r>
@@ -4374,10 +4788,28 @@
       </w:r>
       <w:r>
         <w:rPr>
+          <w:b/>
+          <w:color w:val="B4682C"/>
+          <w:sz w:val="18"/>
+          <w:vertAlign w:val="superscript"/>
+        </w:rPr>
+        <w:t>*</w:t>
+      </w:r>
+      <w:r>
+        <w:rPr>
           <w:color w:val="5B6475"/>
           <w:sz w:val="18"/>
         </w:rPr>
         <w:t>, Wilhan D. G. Nunes, Rafael F. Almeida, Lorena C. Albernaz, Laila S. Espindola, Vanderlan S. Bolzani</w:t>
+      </w:r>
+      <w:r>
+        <w:rPr>
+          <w:b/>
+          <w:color w:val="B4682C"/>
+          <w:sz w:val="18"/>
+          <w:vertAlign w:val="superscript"/>
+        </w:rPr>
+        <w:t>*</w:t>
       </w:r>
       <w:r>
         <w:br/>
@@ -4443,7 +4875,23 @@
           <w:color w:val="5B6475"/>
           <w:sz w:val="18"/>
         </w:rPr>
-        <w:t xml:space="preserve">Paula C. P. Bueno, Marilia Valli, Eduarda A. Moreira, </w:t>
+        <w:t>Paula C. P. Bueno</w:t>
+      </w:r>
+      <w:r>
+        <w:rPr>
+          <w:b/>
+          <w:color w:val="B4682C"/>
+          <w:sz w:val="18"/>
+          <w:vertAlign w:val="superscript"/>
+        </w:rPr>
+        <w:t>*</w:t>
+      </w:r>
+      <w:r>
+        <w:rPr>
+          <w:color w:val="5B6475"/>
+          <w:sz w:val="18"/>
+        </w:rPr>
+        <w:t xml:space="preserve">, Marilia Valli, Eduarda A. Moreira, </w:t>
       </w:r>
       <w:r>
         <w:rPr>
@@ -4704,6 +5152,15 @@
         <w:t>, Suzana Aparecida Silva Queiroz, Guilherme Julião Zocolo, Vanderlan da Silva Bolzani, Marilia Valli</w:t>
       </w:r>
       <w:r>
+        <w:rPr>
+          <w:b/>
+          <w:color w:val="B4682C"/>
+          <w:sz w:val="18"/>
+          <w:vertAlign w:val="superscript"/>
+        </w:rPr>
+        <w:t>*</w:t>
+      </w:r>
+      <w:r>
         <w:br/>
       </w:r>
       <w:r>
@@ -4767,7 +5224,23 @@
           <w:color w:val="5B6475"/>
           <w:sz w:val="18"/>
         </w:rPr>
-        <w:t xml:space="preserve">Ana C. Zanatta, Maiara S. Borges, </w:t>
+        <w:t>Ana C. Zanatta</w:t>
+      </w:r>
+      <w:r>
+        <w:rPr>
+          <w:b/>
+          <w:color w:val="B4682C"/>
+          <w:sz w:val="18"/>
+          <w:vertAlign w:val="superscript"/>
+        </w:rPr>
+        <w:t>*</w:t>
+      </w:r>
+      <w:r>
+        <w:rPr>
+          <w:color w:val="5B6475"/>
+          <w:sz w:val="18"/>
+        </w:rPr>
+        <w:t xml:space="preserve">, Maiara S. Borges, </w:t>
       </w:r>
       <w:r>
         <w:rPr>
@@ -4783,6 +5256,15 @@
           <w:sz w:val="18"/>
         </w:rPr>
         <w:t>, Silvia Cristina Heredia-Vieira, Lourdes Campaner dos Santos, Daniel Rinaldo, Wagner Vilegas</w:t>
+      </w:r>
+      <w:r>
+        <w:rPr>
+          <w:b/>
+          <w:color w:val="B4682C"/>
+          <w:sz w:val="18"/>
+          <w:vertAlign w:val="superscript"/>
+        </w:rPr>
+        <w:t>*</w:t>
       </w:r>
       <w:r>
         <w:br/>
@@ -4853,10 +5335,28 @@
       </w:r>
       <w:r>
         <w:rPr>
+          <w:b/>
+          <w:color w:val="B4682C"/>
+          <w:sz w:val="18"/>
+          <w:vertAlign w:val="superscript"/>
+        </w:rPr>
+        <w:t>*</w:t>
+      </w:r>
+      <w:r>
+        <w:rPr>
           <w:color w:val="5B6475"/>
           <w:sz w:val="18"/>
         </w:rPr>
         <w:t>, Rafael F. de Almeida, Wilhan D. G. Nunes, Paula C. P. Bueno, Andrés M. Caraballo-Rodríguez, Anelize Bauermeister, Pieter C. Dorrestein, Vanderlan S. Bolzani</w:t>
+      </w:r>
+      <w:r>
+        <w:rPr>
+          <w:b/>
+          <w:color w:val="B4682C"/>
+          <w:sz w:val="18"/>
+          <w:vertAlign w:val="superscript"/>
+        </w:rPr>
+        <w:t>*</w:t>
       </w:r>
       <w:r>
         <w:br/>
@@ -4940,6 +5440,15 @@
         <w:t>, Maria L. Zeraik, Rubia Casagrande, Renê O. Do Couto, Sandra R. Georgetti</w:t>
       </w:r>
       <w:r>
+        <w:rPr>
+          <w:b/>
+          <w:color w:val="B4682C"/>
+          <w:sz w:val="18"/>
+          <w:vertAlign w:val="superscript"/>
+        </w:rPr>
+        <w:t>*</w:t>
+      </w:r>
+      <w:r>
         <w:br/>
       </w:r>
       <w:r>
@@ -5003,7 +5512,23 @@
           <w:color w:val="5B6475"/>
           <w:sz w:val="18"/>
         </w:rPr>
-        <w:t xml:space="preserve">Dulce Helena Siqueira Silva, </w:t>
+        <w:t>Dulce Helena Siqueira Silva</w:t>
+      </w:r>
+      <w:r>
+        <w:rPr>
+          <w:b/>
+          <w:color w:val="B4682C"/>
+          <w:sz w:val="18"/>
+          <w:vertAlign w:val="superscript"/>
+        </w:rPr>
+        <w:t>*</w:t>
+      </w:r>
+      <w:r>
+        <w:rPr>
+          <w:color w:val="5B6475"/>
+          <w:sz w:val="18"/>
+        </w:rPr>
+        <w:t xml:space="preserve">, </w:t>
       </w:r>
       <w:r>
         <w:rPr>
@@ -5128,6 +5653,15 @@
         <w:t>, Karina Fraige, Alessandra Cristina Dametto, Vanderlan da Silva Bolzani, Maria Luiza Zeraik</w:t>
       </w:r>
       <w:r>
+        <w:rPr>
+          <w:b/>
+          <w:color w:val="B4682C"/>
+          <w:sz w:val="18"/>
+          <w:vertAlign w:val="superscript"/>
+        </w:rPr>
+        <w:t>*</w:t>
+      </w:r>
+      <w:r>
         <w:br/>
       </w:r>
       <w:r>
@@ -5209,6 +5743,15 @@
         <w:t>, Vanderlan da Silva Bolzani, Diego Cunha Zied, Ieda Spacino Scarminio, Maria Luiza Zeraik</w:t>
       </w:r>
       <w:r>
+        <w:rPr>
+          <w:b/>
+          <w:color w:val="B4682C"/>
+          <w:sz w:val="18"/>
+          <w:vertAlign w:val="superscript"/>
+        </w:rPr>
+        <w:t>*</w:t>
+      </w:r>
+      <w:r>
         <w:br/>
       </w:r>
       <w:r>
@@ -5287,7 +5830,32 @@
           <w:color w:val="5B6475"/>
           <w:sz w:val="18"/>
         </w:rPr>
-        <w:t>, Letícia V. Costa-Lotufo, Alan K. Jarmusch, Pieter C. Dorrestein</w:t>
+        <w:t>, Letícia V. Costa-Lotufo, Alan K. Jarmusch</w:t>
+      </w:r>
+      <w:r>
+        <w:rPr>
+          <w:b/>
+          <w:color w:val="B4682C"/>
+          <w:sz w:val="18"/>
+          <w:vertAlign w:val="superscript"/>
+        </w:rPr>
+        <w:t>*</w:t>
+      </w:r>
+      <w:r>
+        <w:rPr>
+          <w:color w:val="5B6475"/>
+          <w:sz w:val="18"/>
+        </w:rPr>
+        <w:t>, Pieter C. Dorrestein</w:t>
+      </w:r>
+      <w:r>
+        <w:rPr>
+          <w:b/>
+          <w:color w:val="B4682C"/>
+          <w:sz w:val="18"/>
+          <w:vertAlign w:val="superscript"/>
+        </w:rPr>
+        <w:t>*</w:t>
       </w:r>
       <w:r>
         <w:br/>
@@ -5371,6 +5939,15 @@
         <w:t>, Birgit Arndt, Florian Hübner, Heiko Hayen, Hui Zhi, Manuela Raffatellu, Kimberly A. Prather, Lihini I. Aluwihare, Sebastian Böcker, Kerry L. McPhail, Hans-Ulrich Humpf, Uwe Karst, Pieter C. Dorrestein</w:t>
       </w:r>
       <w:r>
+        <w:rPr>
+          <w:b/>
+          <w:color w:val="B4682C"/>
+          <w:sz w:val="18"/>
+          <w:vertAlign w:val="superscript"/>
+        </w:rPr>
+        <w:t>*</w:t>
+      </w:r>
+      <w:r>
         <w:br/>
       </w:r>
       <w:r>
@@ -5477,6 +6054,15 @@
         <w:t>, Karina Fraige, Maria Zeraik, Cláudio Nogueira, Patrícia da Silva, Ana Codo, Giovana Calixto, Alexandra de Medeiros, Marlus Chorilli, Vanderlan Bolzani</w:t>
       </w:r>
       <w:r>
+        <w:rPr>
+          <w:b/>
+          <w:color w:val="B4682C"/>
+          <w:sz w:val="18"/>
+          <w:vertAlign w:val="superscript"/>
+        </w:rPr>
+        <w:t>*</w:t>
+      </w:r>
+      <w:r>
         <w:br/>
       </w:r>
       <w:r>
@@ -5545,10 +6131,28 @@
       </w:r>
       <w:r>
         <w:rPr>
+          <w:b/>
+          <w:color w:val="B4682C"/>
+          <w:sz w:val="18"/>
+          <w:vertAlign w:val="superscript"/>
+        </w:rPr>
+        <w:t>*</w:t>
+      </w:r>
+      <w:r>
+        <w:rPr>
           <w:color w:val="5B6475"/>
           <w:sz w:val="18"/>
         </w:rPr>
         <w:t>, Paula Carolina P. Bueno, Anelize Bauermeister, Rafael Felipe de Almeida, Pieter C. Dorrestein, Alberto José Cavalheiro, Vanderlan S. Bolzani</w:t>
+      </w:r>
+      <w:r>
+        <w:rPr>
+          <w:b/>
+          <w:color w:val="B4682C"/>
+          <w:sz w:val="18"/>
+          <w:vertAlign w:val="superscript"/>
+        </w:rPr>
+        <w:t>*</w:t>
       </w:r>
       <w:r>
         <w:br/>
@@ -5654,7 +6258,32 @@
           <w:color w:val="5B6475"/>
           <w:sz w:val="18"/>
         </w:rPr>
-        <w:t>, Vanderlan da Silva Bolzani, Flávio Junior Caires</w:t>
+        <w:t>, Vanderlan da Silva Bolzani</w:t>
+      </w:r>
+      <w:r>
+        <w:rPr>
+          <w:b/>
+          <w:color w:val="B4682C"/>
+          <w:sz w:val="18"/>
+          <w:vertAlign w:val="superscript"/>
+        </w:rPr>
+        <w:t>*</w:t>
+      </w:r>
+      <w:r>
+        <w:rPr>
+          <w:color w:val="5B6475"/>
+          <w:sz w:val="18"/>
+        </w:rPr>
+        <w:t>, Flávio Junior Caires</w:t>
+      </w:r>
+      <w:r>
+        <w:rPr>
+          <w:b/>
+          <w:color w:val="B4682C"/>
+          <w:sz w:val="18"/>
+          <w:vertAlign w:val="superscript"/>
+        </w:rPr>
+        <w:t>*</w:t>
       </w:r>
       <w:r>
         <w:br/>
@@ -5764,6 +6393,15 @@
         <w:t>, Luiza de Carvalho Bertozo, Vanderlan da Silva Bolzani, Diego Cunha Zied, Valdecir Farias Ximenes, Maria Luiza Zeraik</w:t>
       </w:r>
       <w:r>
+        <w:rPr>
+          <w:b/>
+          <w:color w:val="B4682C"/>
+          <w:sz w:val="18"/>
+          <w:vertAlign w:val="superscript"/>
+        </w:rPr>
+        <w:t>*</w:t>
+      </w:r>
+      <w:r>
         <w:br/>
       </w:r>
       <w:r>
@@ -5835,7 +6473,32 @@
           <w:color w:val="5B6475"/>
           <w:sz w:val="18"/>
         </w:rPr>
-        <w:t>, Emerson Ferreira Queiroz, Laurence Marcourt, Adriano Rutz, Pierre-Marie Allard, Rafael Felipe de Almeida, Nilton Marques Carvalho, Jean-Luc Wolfender, Vanderlan da Silva Bolzani</w:t>
+        <w:t>, Emerson Ferreira Queiroz</w:t>
+      </w:r>
+      <w:r>
+        <w:rPr>
+          <w:b/>
+          <w:color w:val="B4682C"/>
+          <w:sz w:val="18"/>
+          <w:vertAlign w:val="superscript"/>
+        </w:rPr>
+        <w:t>*</w:t>
+      </w:r>
+      <w:r>
+        <w:rPr>
+          <w:color w:val="5B6475"/>
+          <w:sz w:val="18"/>
+        </w:rPr>
+        <w:t>, Laurence Marcourt, Adriano Rutz, Pierre-Marie Allard, Rafael Felipe de Almeida, Nilton Marques Carvalho, Jean-Luc Wolfender, Vanderlan da Silva Bolzani</w:t>
+      </w:r>
+      <w:r>
+        <w:rPr>
+          <w:b/>
+          <w:color w:val="B4682C"/>
+          <w:sz w:val="18"/>
+          <w:vertAlign w:val="superscript"/>
+        </w:rPr>
+        <w:t>*</w:t>
       </w:r>
       <w:r>
         <w:br/>
@@ -5953,6 +6616,15 @@
         <w:t>, Anna Beatriz Sabino Ferrari, Vanderlan da Silva Bolzani, Waldir Pereira Dias, Estela de Oliveira Nunes, Clara Beatriz Hoffmann‐Campo, Maria Luiza Zeraik</w:t>
       </w:r>
       <w:r>
+        <w:rPr>
+          <w:b/>
+          <w:color w:val="B4682C"/>
+          <w:sz w:val="18"/>
+          <w:vertAlign w:val="superscript"/>
+        </w:rPr>
+        <w:t>*</w:t>
+      </w:r>
+      <w:r>
         <w:br/>
       </w:r>
       <w:r>
@@ -6034,6 +6706,15 @@
         <w:t>, Andrea N.L. Batista, Joao M. Batista, Ana C. Codo, Alexandra I. Medeiros, Vanderlan S. Bolzani</w:t>
       </w:r>
       <w:r>
+        <w:rPr>
+          <w:b/>
+          <w:color w:val="B4682C"/>
+          <w:sz w:val="18"/>
+          <w:vertAlign w:val="superscript"/>
+        </w:rPr>
+        <w:t>*</w:t>
+      </w:r>
+      <w:r>
         <w:br/>
       </w:r>
       <w:r>
@@ -6097,7 +6778,23 @@
           <w:color w:val="5B6475"/>
           <w:sz w:val="18"/>
         </w:rPr>
-        <w:t xml:space="preserve">Marilia Valli, </w:t>
+        <w:t>Marilia Valli</w:t>
+      </w:r>
+      <w:r>
+        <w:rPr>
+          <w:b/>
+          <w:color w:val="B4682C"/>
+          <w:sz w:val="18"/>
+          <w:vertAlign w:val="superscript"/>
+        </w:rPr>
+        <w:t>*</w:t>
+      </w:r>
+      <w:r>
+        <w:rPr>
+          <w:color w:val="5B6475"/>
+          <w:sz w:val="18"/>
+        </w:rPr>
+        <w:t xml:space="preserve">, </w:t>
       </w:r>
       <w:r>
         <w:rPr>
@@ -6113,6 +6810,15 @@
           <w:sz w:val="18"/>
         </w:rPr>
         <w:t>, Alan Cesar Pilon, Meri Emili Ferreira Pinto, Nathalia B. Dias, Rafael Teixeira Freire, Ian Castro-Gamboa, Vanderlan da Silva Bolzani</w:t>
+      </w:r>
+      <w:r>
+        <w:rPr>
+          <w:b/>
+          <w:color w:val="B4682C"/>
+          <w:sz w:val="18"/>
+          <w:vertAlign w:val="superscript"/>
+        </w:rPr>
+        <w:t>*</w:t>
       </w:r>
       <w:r>
         <w:br/>
@@ -6178,7 +6884,23 @@
           <w:color w:val="5B6475"/>
           <w:sz w:val="18"/>
         </w:rPr>
-        <w:t xml:space="preserve">Marilia Valli, </w:t>
+        <w:t>Marilia Valli</w:t>
+      </w:r>
+      <w:r>
+        <w:rPr>
+          <w:b/>
+          <w:color w:val="B4682C"/>
+          <w:sz w:val="18"/>
+          <w:vertAlign w:val="superscript"/>
+        </w:rPr>
+        <w:t>*</w:t>
+      </w:r>
+      <w:r>
+        <w:rPr>
+          <w:color w:val="5B6475"/>
+          <w:sz w:val="18"/>
+        </w:rPr>
+        <w:t xml:space="preserve">, </w:t>
       </w:r>
       <w:r>
         <w:rPr>
@@ -6194,6 +6916,15 @@
           <w:sz w:val="18"/>
         </w:rPr>
         <w:t>, Alan Cesar Pilon, Meri Emili Ferreira Pinto, Nathalia B. Dias, Rafael Teixeira Freire, Ian Castro-Gamboa, Vanderlan da Silva Bolzani</w:t>
+      </w:r>
+      <w:r>
+        <w:rPr>
+          <w:b/>
+          <w:color w:val="B4682C"/>
+          <w:sz w:val="18"/>
+          <w:vertAlign w:val="superscript"/>
+        </w:rPr>
+        <w:t>*</w:t>
       </w:r>
       <w:r>
         <w:br/>
@@ -6277,6 +7008,15 @@
         <w:t>, Nilmar Silvio Moretti, Sergio Schenkman, Laurence Marcourt, Mahabir Prashad Gupta, Jean-Luc Wolfender, Emerson Ferreira Queiroz, Milena Botelho Pereira Soares</w:t>
       </w:r>
       <w:r>
+        <w:rPr>
+          <w:b/>
+          <w:color w:val="B4682C"/>
+          <w:sz w:val="18"/>
+          <w:vertAlign w:val="superscript"/>
+        </w:rPr>
+        <w:t>*</w:t>
+      </w:r>
+      <w:r>
         <w:br/>
       </w:r>
       <w:r>
@@ -6358,6 +7098,15 @@
         <w:t>, Jean-Luc Wolfender, Emerson F. Queiroz, Diogo R.M. Moreira, Milena B.P. Soares</w:t>
       </w:r>
       <w:r>
+        <w:rPr>
+          <w:b/>
+          <w:color w:val="B4682C"/>
+          <w:sz w:val="18"/>
+          <w:vertAlign w:val="superscript"/>
+        </w:rPr>
+        <w:t>*</w:t>
+      </w:r>
+      <w:r>
         <w:br/>
       </w:r>
       <w:r>
@@ -6439,6 +7188,15 @@
         <w:t>, Vanderlan S. Bolzani</w:t>
       </w:r>
       <w:r>
+        <w:rPr>
+          <w:b/>
+          <w:color w:val="B4682C"/>
+          <w:sz w:val="18"/>
+          <w:vertAlign w:val="superscript"/>
+        </w:rPr>
+        <w:t>*</w:t>
+      </w:r>
+      <w:r>
         <w:br/>
       </w:r>
       <w:r>
@@ -6538,6 +7296,15 @@
         <w:t>, Vanderlan da Silva Bolzani, Massao Ionashiro, Flávio Junior Caires</w:t>
       </w:r>
       <w:r>
+        <w:rPr>
+          <w:b/>
+          <w:color w:val="B4682C"/>
+          <w:sz w:val="18"/>
+          <w:vertAlign w:val="superscript"/>
+        </w:rPr>
+        <w:t>*</w:t>
+      </w:r>
+      <w:r>
         <w:br/>
       </w:r>
       <w:r>
@@ -6636,6 +7403,15 @@
         <w:t>, Matilda Kråkström, Paulo Wender P. Gomes, Vincent Charron Lamoureux, Ipsita Mohanty, Sofia D. Forssten, Arthur C. Ouwehand, Tuulia Hyötyläinen, Alex M Dickens, Pieter C Dorrestein, Matej Orešič, Santosh Lamichhane</w:t>
       </w:r>
       <w:r>
+        <w:rPr>
+          <w:b/>
+          <w:color w:val="B4682C"/>
+          <w:sz w:val="18"/>
+          <w:vertAlign w:val="superscript"/>
+        </w:rPr>
+        <w:t>*</w:t>
+      </w:r>
+      <w:r>
         <w:br/>
       </w:r>
       <w:r>
@@ -6734,6 +7510,15 @@
         <w:t>, Jasmine Zemlin, Ipsita Mohanty, Marta Sala-Climent, Zhewen Hu, Victoria Delaray, Simpa K. Yeboah, Haoqi Nina Zhao, Andrés M. Caraballo-Rodríguez, Claire E. Williams, Candace L. Williams, Wilhan D. Gonçalves Nunes, Kathleen Dorrestein, Jennifer Cao, Isabelle Shepherd, Rachel Bock, Nathaniel Roethler, Adrian Jinich, Lindsey A. Burnett, Jeremy Carver, Robert N. Devine, Christopher K. Arnatt, Iain A Murray, Rob Knight, Monica Guma, Lee R Hagey, Gary Perdew, Nuno Bandeira, Mingxun Wang, Hiutung Chu, Dionicio Siegel, Pieter C. Dorrestein</w:t>
       </w:r>
       <w:r>
+        <w:rPr>
+          <w:b/>
+          <w:color w:val="B4682C"/>
+          <w:sz w:val="18"/>
+          <w:vertAlign w:val="superscript"/>
+        </w:rPr>
+        <w:t>*</w:t>
+      </w:r>
+      <w:r>
         <w:br/>
       </w:r>
       <w:r>
@@ -6833,6 +7618,15 @@
         <w:t>, Kine Eide Kvitne, Abubaker Patan, Victoria Deleray, Julius Agongo, Harsha Gouda, Wilhan D. Gonçalves Nunes, Shipei Xing, Jasmine Zemlin, Martijn van Faassen, Erin R. Reilly, Imhoi Koo, Andrew D. Patterson, Shirley M. Tsunoda, Mingxun Wang, Dionicio Siegel, Lindsey A. Burnett, Pieter C. Dorrestein</w:t>
       </w:r>
       <w:r>
+        <w:rPr>
+          <w:b/>
+          <w:color w:val="B4682C"/>
+          <w:sz w:val="18"/>
+          <w:vertAlign w:val="superscript"/>
+        </w:rPr>
+        <w:t>*</w:t>
+      </w:r>
+      <w:r>
         <w:br/>
       </w:r>
       <w:r>
@@ -6906,6 +7700,22 @@
           <w:sz w:val="18"/>
           <w:vertAlign w:val="superscript"/>
         </w:rPr>
+        <w:t>†*</w:t>
+      </w:r>
+      <w:r>
+        <w:rPr>
+          <w:color w:val="5B6475"/>
+          <w:sz w:val="18"/>
+        </w:rPr>
+        <w:t>, Wilhan D. Goncalves Nunes</w:t>
+      </w:r>
+      <w:r>
+        <w:rPr>
+          <w:b/>
+          <w:color w:val="B4682C"/>
+          <w:sz w:val="18"/>
+          <w:vertAlign w:val="superscript"/>
+        </w:rPr>
         <w:t>†</w:t>
       </w:r>
       <w:r>
@@ -6913,7 +7723,7 @@
           <w:color w:val="5B6475"/>
           <w:sz w:val="18"/>
         </w:rPr>
-        <w:t>, Wilhan D. Goncalves Nunes</w:t>
+        <w:t>, Shipei Xing, Fernanda de Oliveira, Andres Mauricio Caraballo-Rodriguez, Paulo Wender Portal Gomes, Vincent Charron-Lamoureux, Julius Agongo, Nicole E. Avalon, Tammy Bui, Lucia Cancelada, Marc G. Chevrette, Andres Cumsille, Moyses B. de Araujo, Marilyn De Graeve, Victoria Deleray, Mohamed S. Donia, Mutsawashe B. Dzveta, Yasin El Abiead, Ronald J. Ellis, Donald Franklin, Neha Garg, Harsha Gouda, Claude Y. Hamany Djande, Anastasia Hiskia, Benjamin N. Ho, Chambers C. Hughes, Sunghoon Hwang, Sofia Iliakopoulou, Jennifer E. Iudicello, Alan K. Jarmusch, Triantafyllos Kaloudis, Irina Koester, Robert Konkel, Hector H. F. Koolen, Kine Eide Kvitne, Sabina Leanti La Rosa, Anny Lam, Santosh Lamichhane, Motseoa Lephatsi, Scott Letendre, Sarolt Magyari, Hanna Mazur-Marzec, Daniel McDonald, Ipsita Mohanty, Monica Monge-Loria, David J. Moore, Thiago Andre Moura Veiga, Musiwalo S. Mulaudzi, Lerato Nephali, Griffith Nguyen, Martin Orsagh, Abubaker Patan, Tomas Pluskal, Phillip B. Pope, Livia Soman de Medeiros, Paolo Stincone, Andrej Tekel, Sydney Thomas, Ralph R. Torres, Shirley M. Tsunoda, Fidele Tugizimana, Martijn van Faassen, Felipe Vasquez-Castro, Giovanni A. Vitale, Berenike C. Wagner, Crystal X. Wang, Sevasti-Kiriaki Zervou, Haoqi Nina Zhao, Simone Zuffa, Daniel Petras, Laura-Isobel McCall, Rob Knight, Mingxun Wang, Pieter C. Dorrestein</w:t>
       </w:r>
       <w:r>
         <w:rPr>
@@ -6922,14 +7732,7 @@
           <w:sz w:val="18"/>
           <w:vertAlign w:val="superscript"/>
         </w:rPr>
-        <w:t>†</w:t>
-      </w:r>
-      <w:r>
-        <w:rPr>
-          <w:color w:val="5B6475"/>
-          <w:sz w:val="18"/>
-        </w:rPr>
-        <w:t>, Shipei Xing, Fernanda de Oliveira, Andres Mauricio Caraballo-Rodriguez, Paulo Wender Portal Gomes, Vincent Charron-Lamoureux, Julius Agongo, Nicole E. Avalon, Tammy Bui, Lucia Cancelada, Marc G. Chevrette, Andres Cumsille, Moyses B. de Araujo, Marilyn De Graeve, Victoria Deleray, Mohamed S. Donia, Mutsawashe B. Dzveta, Yasin El Abiead, Ronald J. Ellis, Donald Franklin, Neha Garg, Harsha Gouda, Claude Y. Hamany Djande, Anastasia Hiskia, Benjamin N. Ho, Chambers C. Hughes, Sunghoon Hwang, Sofia Iliakopoulou, Jennifer E. Iudicello, Alan K. Jarmusch, Triantafyllos Kaloudis, Irina Koester, Robert Konkel, Hector H. F. Koolen, Kine Eide Kvitne, Sabina Leanti La Rosa, Anny Lam, Santosh Lamichhane, Motseoa Lephatsi, Scott Letendre, Sarolt Magyari, Hanna Mazur-Marzec, Daniel McDonald, Ipsita Mohanty, Monica Monge-Loria, David J. Moore, Thiago Andre Moura Veiga, Musiwalo S. Mulaudzi, Lerato Nephali, Griffith Nguyen, Martin Orsagh, Abubaker Patan, Tomas Pluskal, Phillip B. Pope, Livia Soman de Medeiros, Paolo Stincone, Andrej Tekel, Sydney Thomas, Ralph R. Torres, Shirley M. Tsunoda, Fidele Tugizimana, Martijn van Faassen, Felipe Vasquez-Castro, Giovanni A. Vitale, Berenike C. Wagner, Crystal X. Wang, Sevasti-Kiriaki Zervou, Haoqi Nina Zhao, Simone Zuffa, Daniel Petras, Laura-Isobel McCall, Rob Knight, Mingxun Wang, Pieter C. Dorrestein</w:t>
+        <w:t>*</w:t>
       </w:r>
       <w:r>
         <w:br/>
@@ -7010,7 +7813,48 @@
           <w:color w:val="5B6475"/>
           <w:sz w:val="18"/>
         </w:rPr>
-        <w:t>, Ipsita Mohanty, Laila Abolfathi, Ricardo Almada-Monter, Jia Yang, Carlynda Lee, Daniel Leanos, Noah Weimann, Wataru Tsuda, Sadie Giddings, Tammy Bui, Eric Ding, Kine Eide Kvitne, Haoqi Nina Zhao, Simone Zuffa, Paulo Wender Portal Gomes, Vivian Nguyen, Aileen Andrade, Maria A Pawlowski, Ashley C Ferland, Elisabeth Orozco, Wilhan Donizete Gonçalves Nunes, Andrés M. Caraballo-Rodríguez, Lurian Caetano David, Kathleen M. Giacomini, Adrian Jinich, Jeremy Carver, Nuno Bandeira, Mingxun Wang, Lindsey A. Burnett, Dionicio Siegel, Pieter C. Dorrestein</w:t>
+        <w:t>, Ipsita Mohanty, Laila Abolfathi, Ricardo Almada-Monter, Jia Yang, Carlynda Lee, Daniel Leanos, Noah Weimann, Wataru Tsuda, Sadie Giddings, Tammy Bui, Eric Ding, Kine Eide Kvitne, Haoqi Nina Zhao, Simone Zuffa, Paulo Wender Portal Gomes, Vivian Nguyen, Aileen Andrade, Maria A Pawlowski, Ashley C Ferland, Elisabeth Orozco, Wilhan Donizete Gonçalves Nunes, Andrés M. Caraballo-Rodríguez, Lurian Caetano David, Kathleen M. Giacomini, Adrian Jinich, Jeremy Carver, Nuno Bandeira, Mingxun Wang, Lindsey A. Burnett</w:t>
+      </w:r>
+      <w:r>
+        <w:rPr>
+          <w:b/>
+          <w:color w:val="B4682C"/>
+          <w:sz w:val="18"/>
+          <w:vertAlign w:val="superscript"/>
+        </w:rPr>
+        <w:t>*</w:t>
+      </w:r>
+      <w:r>
+        <w:rPr>
+          <w:color w:val="5B6475"/>
+          <w:sz w:val="18"/>
+        </w:rPr>
+        <w:t>, Dionicio Siegel</w:t>
+      </w:r>
+      <w:r>
+        <w:rPr>
+          <w:b/>
+          <w:color w:val="B4682C"/>
+          <w:sz w:val="18"/>
+          <w:vertAlign w:val="superscript"/>
+        </w:rPr>
+        <w:t>*</w:t>
+      </w:r>
+      <w:r>
+        <w:rPr>
+          <w:color w:val="5B6475"/>
+          <w:sz w:val="18"/>
+        </w:rPr>
+        <w:t>, Pieter C. Dorrestein</w:t>
+      </w:r>
+      <w:r>
+        <w:rPr>
+          <w:b/>
+          <w:color w:val="B4682C"/>
+          <w:sz w:val="18"/>
+          <w:vertAlign w:val="superscript"/>
+        </w:rPr>
+        <w:t>*</w:t>
       </w:r>
       <w:r>
         <w:br/>
@@ -7110,6 +7954,15 @@
           <w:sz w:val="18"/>
         </w:rPr>
         <w:t>, Robin Schmid, Simone Zuffa, Tito Damiani, Luis-Manuel Quiros-Guerrero, Andrés Mauricio Caraballo-Rodríguez, Haoqi Nina Zhao, Heejung Yang, Shipei Xing, Vincent Charron-Lamoureux, Desnor N. Chigumba, Brian E. Sedio, Jonathan A. Myers, Pierre-Marie Allard, Thomas V. Harwood, Giselle Tamayo-Castillo, Kyo Bin Kang, Emmanuel Defossez, Hector H. F. Koolen, Milton Nascimento da Silva, Consuelo Yumiko Yoshioka e Silva, Sergio Rasmann, Tom W. N. Walker, Gaëtan Glauser, José Miguel Chaves-Fallas, Bruno David, Hyunwoo Kim, Kyu Hyeong Lee, Myeong Ji Kim, Won Jun Choi, Young-Sam Keum, Emilly J. S. P. de Lima, Lívia Soman de Medeiros, Giovana A. Bataglion, Emmanoel V. Costa, Felipe M. A. da Silva, Alice Rhelly V. Carvalho, José Diogo E. Reis, Sônia Pamplona, Eunah Jeong, Kyungha Lee, Geum Jin Kim, Yun-Seo Kil, Joo-Won Nam, Hyukjae Choi, Yoo Kyong Han, Si Young Park, Ki Yong Lee, Changling Hu, Yilun Dong, Shengmin Sang, Colin R. Morrison, Ricardo Moreira Borges, Andrew Magno Teixeira, Seo Yoon Lee, Bum Soo Lee, Se Yun Jeong, Ki Hyun Kim, Adriano Rutz, Arnaud Gaudry, Edouard Bruelhart, Iris F. Kappers, Rumyana Karlova, Mara Meisenburg, Roland Berdaguer, J. Sebastián Tello, David Henderson, Leslie Cayola, S. Joseph Wright, David N. Allen, Kristina J. Anderson-Teixeira, Jennifer L. Baltzer, James A. Lutz, Sean M. McMahon, Geoffrey G. Parker, John D. Parker, Trent R. Northen, Benjamin P. Bowen, Tomáš Pluskal, Justin J. J. van der Hooft, Jeremy J. Carver, Nuno Bandeira, Benjamin S. Pullman, Jean-Luc Wolfender, Roland D. Kersten, Mingxun Wang, Pieter C. Dorrestein</w:t>
+      </w:r>
+      <w:r>
+        <w:rPr>
+          <w:b/>
+          <w:color w:val="B4682C"/>
+          <w:sz w:val="18"/>
+          <w:vertAlign w:val="superscript"/>
+        </w:rPr>
+        <w:t>*</w:t>
       </w:r>
       <w:r>
         <w:br/>

</xml_diff>

<commit_message>
Corresponding authors: Stevia paper and MASH paper (edited by Helena)
Co-Authored-By: Claude Opus 5.5 <noreply@anthropic.com>
</commit_message>
<xml_diff>
--- a/cv/Helena_Mannochio_Russo_CV.docx
+++ b/cv/Helena_Mannochio_Russo_CV.docx
@@ -1563,6 +1563,15 @@
         <w:t>, Jingjing Hu, Mojgan Hosseini, Rohit Loomba, Pieter C. Dorrestein, Rob Knight, Amir Zarrinpar</w:t>
       </w:r>
       <w:r>
+        <w:rPr>
+          <w:b/>
+          <w:color w:val="B4682C"/>
+          <w:sz w:val="18"/>
+          <w:vertAlign w:val="superscript"/>
+        </w:rPr>
+        <w:t>*</w:t>
+      </w:r>
+      <w:r>
         <w:br/>
       </w:r>
       <w:r>
@@ -6227,6 +6236,30 @@
           <w:sz w:val="18"/>
           <w:vertAlign w:val="superscript"/>
         </w:rPr>
+        <w:t>†*</w:t>
+      </w:r>
+      <w:r>
+        <w:rPr>
+          <w:color w:val="5B6475"/>
+          <w:sz w:val="18"/>
+        </w:rPr>
+        <w:t xml:space="preserve">, </w:t>
+      </w:r>
+      <w:r>
+        <w:rPr>
+          <w:b/>
+          <w:color w:val="1B2230"/>
+          <w:sz w:val="18"/>
+        </w:rPr>
+        <w:t>Helena Mannochio Russo</w:t>
+      </w:r>
+      <w:r>
+        <w:rPr>
+          <w:b/>
+          <w:color w:val="B4682C"/>
+          <w:sz w:val="18"/>
+          <w:vertAlign w:val="superscript"/>
+        </w:rPr>
         <w:t>†</w:t>
       </w:r>
       <w:r>
@@ -6234,56 +6267,7 @@
           <w:color w:val="5B6475"/>
           <w:sz w:val="18"/>
         </w:rPr>
-        <w:t xml:space="preserve">, </w:t>
-      </w:r>
-      <w:r>
-        <w:rPr>
-          <w:b/>
-          <w:color w:val="1B2230"/>
-          <w:sz w:val="18"/>
-        </w:rPr>
-        <w:t>Helena Mannochio Russo</w:t>
-      </w:r>
-      <w:r>
-        <w:rPr>
-          <w:b/>
-          <w:color w:val="B4682C"/>
-          <w:sz w:val="18"/>
-          <w:vertAlign w:val="superscript"/>
-        </w:rPr>
-        <w:t>†</w:t>
-      </w:r>
-      <w:r>
-        <w:rPr>
-          <w:color w:val="5B6475"/>
-          <w:sz w:val="18"/>
-        </w:rPr>
-        <w:t>, Vanderlan da Silva Bolzani</w:t>
-      </w:r>
-      <w:r>
-        <w:rPr>
-          <w:b/>
-          <w:color w:val="B4682C"/>
-          <w:sz w:val="18"/>
-          <w:vertAlign w:val="superscript"/>
-        </w:rPr>
-        <w:t>*</w:t>
-      </w:r>
-      <w:r>
-        <w:rPr>
-          <w:color w:val="5B6475"/>
-          <w:sz w:val="18"/>
-        </w:rPr>
-        <w:t>, Flávio Junior Caires</w:t>
-      </w:r>
-      <w:r>
-        <w:rPr>
-          <w:b/>
-          <w:color w:val="B4682C"/>
-          <w:sz w:val="18"/>
-          <w:vertAlign w:val="superscript"/>
-        </w:rPr>
-        <w:t>*</w:t>
+        <w:t>, Vanderlan da Silva Bolzani, Flávio Junior Caires</w:t>
       </w:r>
       <w:r>
         <w:br/>

</xml_diff>

<commit_message>
Workshops given move to Presentations (with Workshop tag) and drive the CV; Events keeps organized events
Co-Authored-By: Claude Opus 5.5 <noreply@anthropic.com>
</commit_message>
<xml_diff>
--- a/cv/Helena_Mannochio_Russo_CV.docx
+++ b/cv/Helena_Mannochio_Russo_CV.docx
@@ -9130,7 +9130,7 @@
         <w:rPr>
           <w:color w:val="5B6475"/>
         </w:rPr>
-        <w:t>In person at the Inserm Workshop 287 - Lipidomics: principles and applications in the field of health. Bordeaux, France. Estimated audience: 70 people.</w:t>
+        <w:t>Inserm Workshop 287 - Lipidomics: principles and applications in the field of health, Bordeaux, France. Estimated audience: 70 people.</w:t>
       </w:r>
     </w:p>
     <w:p>
@@ -9165,7 +9165,7 @@
         <w:rPr>
           <w:color w:val="5B6475"/>
         </w:rPr>
-        <w:t>In person at the International Conference on Natural Product Discovery and Development in the Genomic Era. San Diego, CA, United States. Estimated audience: 50 people.</w:t>
+        <w:t>International Conference on Natural Product Discovery and Development in the Genomic Era, San Diego, CA, United States. Estimated audience: 50 people.</w:t>
       </w:r>
     </w:p>
     <w:p>
@@ -9235,7 +9235,7 @@
         <w:rPr>
           <w:color w:val="5B6475"/>
         </w:rPr>
-        <w:t>In person at the 20th Annual International Conference of the Metabolomics Society. Osaka, Japan. Estimated audience: 50 people.</w:t>
+        <w:t>20th Annual International Conference of the Metabolomics Society, Osaka, Japan. Estimated audience: 50 people.</w:t>
       </w:r>
     </w:p>
     <w:p>
@@ -9305,7 +9305,7 @@
         <w:rPr>
           <w:color w:val="5B6475"/>
         </w:rPr>
-        <w:t>In person at the International Conference on Natural Product Discovery and Development in the Genomic Era. San Diego, CA, United States. Estimated audience: 50 people.</w:t>
+        <w:t>International Conference on Natural Product Discovery and Development in the Genomic Era, San Diego, CA, United States. Estimated audience: 50 people.</w:t>
       </w:r>
     </w:p>
     <w:p>

</xml_diff>

<commit_message>
Add in-press J Nutr paper; In press section on Publications page
Co-Authored-By: Claude Opus 5.5 <noreply@anthropic.com>
</commit_message>
<xml_diff>
--- a/cv/Helena_Mannochio_Russo_CV.docx
+++ b/cv/Helena_Mannochio_Russo_CV.docx
@@ -7350,6 +7350,84 @@
           <w:color w:val="1F4F8F"/>
           <w:sz w:val="18"/>
         </w:rPr>
+        <w:t>2.</w:t>
+        <w:tab/>
+      </w:r>
+      <w:r>
+        <w:rPr>
+          <w:b/>
+          <w:color w:val="1B2230"/>
+          <w:sz w:val="18"/>
+        </w:rPr>
+        <w:t>Fecal Metabolomics-Based Dietary Profiling Reveals Food Markers of HIV Brain Health Disorders</w:t>
+      </w:r>
+      <w:r>
+        <w:br/>
+      </w:r>
+      <w:r>
+        <w:rPr>
+          <w:color w:val="5B6475"/>
+          <w:sz w:val="18"/>
+        </w:rPr>
+        <w:t xml:space="preserve">Crystal X. Wang, Harsha Gouda, Toon A.W. Scheurink, Jasmine Zemlin, Christine E. Spaven, </w:t>
+      </w:r>
+      <w:r>
+        <w:rPr>
+          <w:b/>
+          <w:color w:val="1B2230"/>
+          <w:sz w:val="18"/>
+        </w:rPr>
+        <w:t>Helena Mannochio-Russo</w:t>
+      </w:r>
+      <w:r>
+        <w:rPr>
+          <w:color w:val="5B6475"/>
+          <w:sz w:val="18"/>
+        </w:rPr>
+        <w:t>, Jennifer E. Iudicello, Robert K. Heaton, David J. Moore, Scott L. Letendre, Mariana Cherner, Donald R. Franklin, Monica Guma, Andrew H. Miller, Rob Knight, Pieter C. Dorrestein, Ronald J. Ellis</w:t>
+      </w:r>
+      <w:r>
+        <w:rPr>
+          <w:b/>
+          <w:color w:val="B4682C"/>
+          <w:sz w:val="18"/>
+          <w:vertAlign w:val="superscript"/>
+        </w:rPr>
+        <w:t>*</w:t>
+      </w:r>
+      <w:r>
+        <w:br/>
+      </w:r>
+      <w:r>
+        <w:rPr>
+          <w:i/>
+          <w:color w:val="5B6475"/>
+          <w:sz w:val="18"/>
+        </w:rPr>
+        <w:t>Journal of Nutrition</w:t>
+      </w:r>
+      <w:r>
+        <w:rPr>
+          <w:color w:val="5B6475"/>
+          <w:sz w:val="18"/>
+        </w:rPr>
+        <w:t>, In press, 2026.</w:t>
+      </w:r>
+    </w:p>
+    <w:p>
+      <w:pPr>
+        <w:tabs>
+          <w:tab w:pos="576" w:val="left"/>
+        </w:tabs>
+        <w:spacing w:before="0" w:after="80"/>
+        <w:ind w:left="576" w:hanging="576"/>
+      </w:pPr>
+      <w:r>
+        <w:rPr>
+          <w:b/>
+          <w:color w:val="1F4F8F"/>
+          <w:sz w:val="18"/>
+        </w:rPr>
         <w:t>1.</w:t>
         <w:tab/>
       </w:r>
@@ -10131,7 +10209,7 @@
           <w:color w:val="5B6475"/>
           <w:sz w:val="17"/>
         </w:rPr>
-        <w:t>Last updated October 11, 2026</w:t>
+        <w:t>Last updated October 10, 2026</w:t>
       </w:r>
     </w:p>
     <w:sectPr>

</xml_diff>